<commit_message>
Updated some course files
</commit_message>
<xml_diff>
--- a/Checkpoints/Checkpoint #2 (INFO-3111).docx
+++ b/Checkpoints/Checkpoint #2 (INFO-3111).docx
@@ -385,94 +385,6 @@
         <w:ind w:left="426" w:hanging="284"/>
       </w:pPr>
       <w:r>
-        <w:rPr>
-          <w:noProof/>
-        </w:rPr>
-        <mc:AlternateContent>
-          <mc:Choice Requires="wps">
-            <w:drawing>
-              <wp:anchor distT="0" distB="0" distL="114300" distR="114300" simplePos="0" relativeHeight="251659264" behindDoc="0" locked="0" layoutInCell="1" allowOverlap="1" wp14:anchorId="4D1590D7" wp14:editId="7101864A">
-                <wp:simplePos x="0" y="0"/>
-                <wp:positionH relativeFrom="column">
-                  <wp:posOffset>5336438</wp:posOffset>
-                </wp:positionH>
-                <wp:positionV relativeFrom="paragraph">
-                  <wp:posOffset>85674</wp:posOffset>
-                </wp:positionV>
-                <wp:extent cx="1543508" cy="1199693"/>
-                <wp:effectExtent l="0" t="0" r="228600" b="95885"/>
-                <wp:wrapNone/>
-                <wp:docPr id="1381641409" name="Connector: Elbow 1"/>
-                <wp:cNvGraphicFramePr/>
-                <a:graphic xmlns:a="http://schemas.openxmlformats.org/drawingml/2006/main">
-                  <a:graphicData uri="http://schemas.microsoft.com/office/word/2010/wordprocessingShape">
-                    <wps:wsp>
-                      <wps:cNvCnPr/>
-                      <wps:spPr>
-                        <a:xfrm>
-                          <a:off x="0" y="0"/>
-                          <a:ext cx="1543508" cy="1199693"/>
-                        </a:xfrm>
-                        <a:prstGeom prst="bentConnector3">
-                          <a:avLst>
-                            <a:gd name="adj1" fmla="val 113363"/>
-                          </a:avLst>
-                        </a:prstGeom>
-                        <a:ln w="25400">
-                          <a:solidFill>
-                            <a:srgbClr val="FF0000"/>
-                          </a:solidFill>
-                          <a:tailEnd type="triangle"/>
-                        </a:ln>
-                      </wps:spPr>
-                      <wps:style>
-                        <a:lnRef idx="1">
-                          <a:schemeClr val="accent1"/>
-                        </a:lnRef>
-                        <a:fillRef idx="0">
-                          <a:schemeClr val="accent1"/>
-                        </a:fillRef>
-                        <a:effectRef idx="0">
-                          <a:schemeClr val="accent1"/>
-                        </a:effectRef>
-                        <a:fontRef idx="minor">
-                          <a:schemeClr val="tx1"/>
-                        </a:fontRef>
-                      </wps:style>
-                      <wps:bodyPr/>
-                    </wps:wsp>
-                  </a:graphicData>
-                </a:graphic>
-                <wp14:sizeRelH relativeFrom="margin">
-                  <wp14:pctWidth>0</wp14:pctWidth>
-                </wp14:sizeRelH>
-                <wp14:sizeRelV relativeFrom="margin">
-                  <wp14:pctHeight>0</wp14:pctHeight>
-                </wp14:sizeRelV>
-              </wp:anchor>
-            </w:drawing>
-          </mc:Choice>
-          <mc:Fallback>
-            <w:pict>
-              <v:shapetype w14:anchorId="657415D9" id="_x0000_t34" coordsize="21600,21600" o:spt="34" o:oned="t" adj="10800" path="m,l@0,0@0,21600,21600,21600e" filled="f">
-                <v:stroke joinstyle="miter"/>
-                <v:formulas>
-                  <v:f eqn="val #0"/>
-                </v:formulas>
-                <v:path arrowok="t" fillok="f" o:connecttype="none"/>
-                <v:handles>
-                  <v:h position="#0,center"/>
-                </v:handles>
-                <o:lock v:ext="edit" shapetype="t"/>
-              </v:shapetype>
-              <v:shape id="Connector: Elbow 1" o:spid="_x0000_s1026" type="#_x0000_t34" style="position:absolute;margin-left:420.2pt;margin-top:6.75pt;width:121.55pt;height:94.45pt;z-index:251659264;visibility:visible;mso-wrap-style:square;mso-width-percent:0;mso-height-percent:0;mso-wrap-distance-left:9pt;mso-wrap-distance-top:0;mso-wrap-distance-right:9pt;mso-wrap-distance-bottom:0;mso-position-horizontal:absolute;mso-position-horizontal-relative:text;mso-position-vertical:absolute;mso-position-vertical-relative:text;mso-width-percent:0;mso-height-percent:0;mso-width-relative:margin;mso-height-relative:margin" o:gfxdata="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" adj="24486" strokecolor="red" strokeweight="2pt">
-                <v:stroke endarrow="block"/>
-              </v:shape>
-            </w:pict>
-          </mc:Fallback>
-        </mc:AlternateContent>
-      </w:r>
-      <w:r>
         <w:t>Rendered as solid, wireframe, or as points</w:t>
       </w:r>
       <w:r>
@@ -546,45 +458,6 @@
       </w:r>
       <w:r>
         <w:t xml:space="preserve">. </w:t>
-      </w:r>
-    </w:p>
-    <w:p>
-      <w:pPr>
-        <w:numPr>
-          <w:ilvl w:val="0"/>
-          <w:numId w:val="2"/>
-        </w:numPr>
-        <w:ind w:left="426" w:hanging="284"/>
-      </w:pPr>
-      <w:r>
-        <w:rPr>
-          <w:b/>
-          <w:bCs/>
-        </w:rPr>
-        <w:t>BONUS 50%:</w:t>
-      </w:r>
-      <w:r>
-        <w:t xml:space="preserve"> You show the “indexed model” </w:t>
-      </w:r>
-      <w:r>
-        <w:rPr>
-          <w:i/>
-          <w:iCs/>
-        </w:rPr>
-        <w:t>properly</w:t>
-      </w:r>
-      <w:r>
-        <w:t xml:space="preserve"> (instead of the mess you’ll almost certainly get when you just display the list of vertices as triangles). Remember that you really want to show the </w:t>
-      </w:r>
-      <w:r>
-        <w:rPr>
-          <w:i/>
-          <w:iCs/>
-        </w:rPr>
-        <w:t xml:space="preserve">triangles </w:t>
-      </w:r>
-      <w:r>
-        <w:t>that index the vertices, so you’d have to make an array of vertices from the triangle (“face”) list.</w:t>
       </w:r>
     </w:p>
     <w:p>

</xml_diff>